<commit_message>
Drop Dummy and HistGradientBoosting from the whole project
The course only covered Logistic Regression, Decision Tree and Random Forest.

- Feature-set A/B/C comparison and the performance-vs-K curve are recomputed
  with Random Forest (A 0.8416, B 0.8427, C 0.8421; C trains twice as fast).
- The baseline is kept but stated as "predict not-cancelled for every booking"
  instead of naming DummyClassifier.
- The web app now serves a reduced Random Forest (150 trees, max_depth 25),
  28.8 MB, test F1 0.8376 at threshold 0.4754, replacing the HGB model.
- Report, slides, slide plan, README and the notebook updated to match.

Co-Authored-By: Claude Opus 5 <noreply@anthropic.com>
</commit_message>
<xml_diff>
--- a/docs/รายงานโครงงาน-Hotel-Booking-Cancellation-Prediction.docx
+++ b/docs/รายงานโครงงาน-Hotel-Booking-Cancellation-Prediction.docx
@@ -4639,7 +4639,7 @@
           <w:i w:val="0"/>
           <w:sz w:val="32"/>
         </w:rPr>
-        <w:t>เปรียบเทียบชุดตัวแปร 3 ชุดด้วยแบบจำลองเดียวกัน (HistGradientBoosting ค่าเริ่มต้น) และวิธี Cross-Validation แบบเดียวกัน โดยเปลี่ยนเฉพาะชุดตัวแปร</w:t>
+        <w:t>เปรียบเทียบชุดตัวแปร 3 ชุดด้วยแบบจำลองเดียวกัน (Random Forest ค่าเริ่มต้น) และวิธี Cross-Validation แบบเดียวกัน โดยเปลี่ยนเฉพาะชุดตัวแปร</w:t>
       </w:r>
     </w:p>
     <w:tbl>
@@ -4795,7 +4795,7 @@
                 <w:i w:val="0"/>
                 <w:sz w:val="30"/>
               </w:rPr>
-              <w:t>0.8103 ± 0.0049</w:t>
+              <w:t>0.8416 ± 0.0037</w:t>
             </w:r>
           </w:p>
         </w:tc>
@@ -4811,7 +4811,7 @@
                 <w:i w:val="0"/>
                 <w:sz w:val="30"/>
               </w:rPr>
-              <w:t>0.9420</w:t>
+              <w:t>0.9551</w:t>
             </w:r>
           </w:p>
         </w:tc>
@@ -4827,7 +4827,7 @@
                 <w:i w:val="0"/>
                 <w:sz w:val="30"/>
               </w:rPr>
-              <w:t>0.9157</w:t>
+              <w:t>0.9367</w:t>
             </w:r>
           </w:p>
         </w:tc>
@@ -4877,7 +4877,7 @@
                 <w:i w:val="0"/>
                 <w:sz w:val="30"/>
               </w:rPr>
-              <w:t>0.8127 ± 0.0042</w:t>
+              <w:t>0.8427 ± 0.0028</w:t>
             </w:r>
           </w:p>
         </w:tc>
@@ -4893,7 +4893,7 @@
                 <w:i w:val="0"/>
                 <w:sz w:val="30"/>
               </w:rPr>
-              <w:t>0.9428</w:t>
+              <w:t>0.9554</w:t>
             </w:r>
           </w:p>
         </w:tc>
@@ -4909,7 +4909,7 @@
                 <w:i w:val="0"/>
                 <w:sz w:val="30"/>
               </w:rPr>
-              <w:t>0.9165</w:t>
+              <w:t>0.9372</w:t>
             </w:r>
           </w:p>
         </w:tc>
@@ -4959,7 +4959,7 @@
                 <w:i w:val="0"/>
                 <w:sz w:val="30"/>
               </w:rPr>
-              <w:t>0.8112 ± 0.0027</w:t>
+              <w:t>0.8421 ± 0.0036</w:t>
             </w:r>
           </w:p>
         </w:tc>
@@ -4975,7 +4975,7 @@
                 <w:i w:val="0"/>
                 <w:sz w:val="30"/>
               </w:rPr>
-              <w:t>0.9417</w:t>
+              <w:t>0.9546</w:t>
             </w:r>
           </w:p>
         </w:tc>
@@ -4991,7 +4991,7 @@
                 <w:i w:val="0"/>
                 <w:sz w:val="30"/>
               </w:rPr>
-              <w:t>0.9154</w:t>
+              <w:t>0.9358</w:t>
             </w:r>
           </w:p>
         </w:tc>
@@ -5023,7 +5023,7 @@
           <w:i w:val="0"/>
           <w:sz w:val="32"/>
         </w:rPr>
-        <w:t>ผลต่างของค่า F1 ระหว่างชุด B และ C เท่ากับ 0.0015 ซึ่งน้อยกว่าค่าส่วนเบี่ยงเบนมาตรฐาน (0.0042) จึงถือว่าไม่แตกต่างกันอย่างมีนัยสำคัญ แต่ชุด C ใช้ตัวแปรเพียงครึ่งเดียว มีค่าส่วนเบี่ยงเบนมาตรฐานต่ำที่สุดคือเสถียรที่สุด และใช้เวลาฝึกน้อยที่สุด คณะผู้จัดทำจึงเลือกชุด C เป็นชุดตัวแปรสำหรับพัฒนาแบบจำลอง</w:t>
+        <w:t>ผลต่างของค่า F1 ระหว่างชุด B และ C เท่ากับ 0.0006 ซึ่งน้อยกว่าค่าส่วนเบี่ยงเบนมาตรฐาน (0.0028) จึงถือว่าไม่แตกต่างกันอย่างมีนัยสำคัญ แต่ชุด C ใช้ตัวแปรเพียงครึ่งเดียวของชุด B และใช้เวลาฝึกเพียง 8.7 วินาที เทียบกับ 17.5 วินาทีของชุด B คือเร็วขึ้นประมาณเท่าตัว คณะผู้จัดทำจึงเลือกชุด C เป็นชุดตัวแปรสำหรับพัฒนาแบบจำลอง</w:t>
       </w:r>
     </w:p>
     <w:p>
@@ -5034,7 +5034,7 @@
       <w:r>
         <w:drawing>
           <wp:inline>
-            <wp:extent cx="4389120" cy="2397669"/>
+            <wp:extent cx="4389120" cy="2438400"/>
             <wp:docPr id="8" name="Picture 8"/>
             <wp:cNvGraphicFramePr>
               <a:graphicFrameLocks noChangeAspect="1"/>
@@ -5055,7 +5055,7 @@
                   <pic:spPr>
                     <a:xfrm>
                       <a:off x="0" y="0"/>
-                      <a:ext cx="4389120" cy="2397669"/>
+                      <a:ext cx="4389120" cy="2438400"/>
                     </a:xfrm>
                     <a:prstGeom prst="rect"/>
                   </pic:spPr>
@@ -5078,7 +5078,7 @@
           <w:i/>
           <w:sz w:val="28"/>
         </w:rPr>
-        <w:t>รูปที่ 8  ค่า F1 เมื่อเพิ่มจำนวนตัวแปร (K) ตามลำดับความสำคัญ ใช้ประกอบการเลือก K = 18</w:t>
+        <w:t>รูปที่ 8  ค่า F1 (Random Forest) เมื่อเพิ่มจำนวนตัวแปร (K) ตามลำดับความสำคัญ ใช้ประกอบการเลือก K = 18</w:t>
       </w:r>
     </w:p>
     <w:p>
@@ -5161,7 +5161,7 @@
           <w:i w:val="0"/>
           <w:sz w:val="32"/>
         </w:rPr>
-        <w:t>เลือกเปรียบเทียบแบบจำลอง 5 ชนิด เรียงจากง่ายไปซับซ้อน เพื่อให้เห็นว่าความซับซ้อนที่เพิ่มขึ้น ให้ผลลัพธ์ที่ดีขึ้นจริงหรือไม่</w:t>
+        <w:t>เลือกเปรียบเทียบแบบจำลอง 3 ชนิด เรียงจากง่ายไปซับซ้อน เพื่อให้เห็นว่าความซับซ้อนที่เพิ่มขึ้น ให้ผลลัพธ์ที่ดีขึ้นจริงหรือไม่</w:t>
       </w:r>
     </w:p>
     <w:tbl>
@@ -5231,7 +5231,7 @@
                 <w:i w:val="0"/>
                 <w:sz w:val="30"/>
               </w:rPr>
-              <w:t>Dummy Classifier</w:t>
+              <w:t>Logistic Regression</w:t>
             </w:r>
           </w:p>
         </w:tc>
@@ -5247,7 +5247,7 @@
                 <w:i w:val="0"/>
                 <w:sz w:val="30"/>
               </w:rPr>
-              <w:t>เกณฑ์ขั้นต่ำ ทำนายคลาสที่พบบ่อยที่สุดเสมอ</w:t>
+              <w:t>แบบจำลองเชิงเส้น ตีความง่าย ใช้เป็นฐานเปรียบเทียบ</w:t>
             </w:r>
           </w:p>
         </w:tc>
@@ -5265,7 +5265,7 @@
                 <w:i w:val="0"/>
                 <w:sz w:val="30"/>
               </w:rPr>
-              <w:t>Logistic Regression</w:t>
+              <w:t>Decision Tree</w:t>
             </w:r>
           </w:p>
         </w:tc>
@@ -5281,7 +5281,7 @@
                 <w:i w:val="0"/>
                 <w:sz w:val="30"/>
               </w:rPr>
-              <w:t>แบบจำลองเชิงเส้น ตีความง่าย ใช้เป็นฐานเปรียบเทียบ</w:t>
+              <w:t>ต้นไม้เดี่ยว ใช้แสดงปัญหา Overfitting ให้เห็นชัด</w:t>
             </w:r>
           </w:p>
         </w:tc>
@@ -5299,7 +5299,7 @@
                 <w:i w:val="0"/>
                 <w:sz w:val="30"/>
               </w:rPr>
-              <w:t>Decision Tree</w:t>
+              <w:t>Random Forest</w:t>
             </w:r>
           </w:p>
         </w:tc>
@@ -5315,75 +5315,7 @@
                 <w:i w:val="0"/>
                 <w:sz w:val="30"/>
               </w:rPr>
-              <w:t>ต้นไม้เดี่ยว ใช้แสดงปัญหา Overfitting ให้เห็นชัด</w:t>
-            </w:r>
-          </w:p>
-        </w:tc>
-      </w:tr>
-      <w:tr>
-        <w:tc>
-          <w:tcPr>
-            <w:tcW w:type="dxa" w:w="2880"/>
-          </w:tcPr>
-          <w:p>
-            <w:r>
-              <w:rPr>
-                <w:rFonts w:ascii="TH SarabunPSK" w:hAnsi="TH SarabunPSK" w:cs="TH SarabunPSK"/>
-                <w:b w:val="0"/>
-                <w:i w:val="0"/>
-                <w:sz w:val="30"/>
-              </w:rPr>
-              <w:t>Random Forest</w:t>
-            </w:r>
-          </w:p>
-        </w:tc>
-        <w:tc>
-          <w:tcPr>
-            <w:tcW w:type="dxa" w:w="5760"/>
-          </w:tcPr>
-          <w:p>
-            <w:r>
-              <w:rPr>
-                <w:rFonts w:ascii="TH SarabunPSK" w:hAnsi="TH SarabunPSK" w:cs="TH SarabunPSK"/>
-                <w:b w:val="0"/>
-                <w:i w:val="0"/>
-                <w:sz w:val="30"/>
-              </w:rPr>
               <w:t>Ensemble แบบ Bagging ลดความแปรปรวนของต้นไม้เดี่ยว</w:t>
-            </w:r>
-          </w:p>
-        </w:tc>
-      </w:tr>
-      <w:tr>
-        <w:tc>
-          <w:tcPr>
-            <w:tcW w:type="dxa" w:w="2880"/>
-          </w:tcPr>
-          <w:p>
-            <w:r>
-              <w:rPr>
-                <w:rFonts w:ascii="TH SarabunPSK" w:hAnsi="TH SarabunPSK" w:cs="TH SarabunPSK"/>
-                <w:b w:val="0"/>
-                <w:i w:val="0"/>
-                <w:sz w:val="30"/>
-              </w:rPr>
-              <w:t>HistGradientBoosting</w:t>
-            </w:r>
-          </w:p>
-        </w:tc>
-        <w:tc>
-          <w:tcPr>
-            <w:tcW w:type="dxa" w:w="5760"/>
-          </w:tcPr>
-          <w:p>
-            <w:r>
-              <w:rPr>
-                <w:rFonts w:ascii="TH SarabunPSK" w:hAnsi="TH SarabunPSK" w:cs="TH SarabunPSK"/>
-                <w:b w:val="0"/>
-                <w:i w:val="0"/>
-                <w:sz w:val="30"/>
-              </w:rPr>
-              <w:t>Ensemble แบบ Boosting ทำงานเร็วและเหมาะกับข้อมูลขนาดใหญ่</w:t>
             </w:r>
           </w:p>
         </w:tc>
@@ -5727,7 +5659,7 @@
                 <w:i w:val="0"/>
                 <w:sz w:val="30"/>
               </w:rPr>
-              <w:t>Dummy</w:t>
+              <w:t>Logistic Regression</w:t>
             </w:r>
           </w:p>
         </w:tc>
@@ -5743,7 +5675,7 @@
                 <w:i w:val="0"/>
                 <w:sz w:val="30"/>
               </w:rPr>
-              <w:t>0.0000</w:t>
+              <w:t>0.7629</w:t>
             </w:r>
           </w:p>
         </w:tc>
@@ -5759,7 +5691,7 @@
                 <w:i w:val="0"/>
                 <w:sz w:val="30"/>
               </w:rPr>
-              <w:t>0.5000</w:t>
+              <w:t>0.9119</w:t>
             </w:r>
           </w:p>
         </w:tc>
@@ -5775,7 +5707,7 @@
                 <w:i w:val="0"/>
                 <w:sz w:val="30"/>
               </w:rPr>
-              <w:t>0.0000</w:t>
+              <w:t>0.7170</w:t>
             </w:r>
           </w:p>
         </w:tc>
@@ -5791,7 +5723,7 @@
                 <w:i w:val="0"/>
                 <w:sz w:val="30"/>
               </w:rPr>
-              <w:t>0.000</w:t>
+              <w:t>0.001</w:t>
             </w:r>
           </w:p>
         </w:tc>
@@ -5809,7 +5741,7 @@
                 <w:i w:val="0"/>
                 <w:sz w:val="30"/>
               </w:rPr>
-              <w:t>Logistic Regression</w:t>
+              <w:t>Decision Tree</w:t>
             </w:r>
           </w:p>
         </w:tc>
@@ -5825,7 +5757,7 @@
                 <w:i w:val="0"/>
                 <w:sz w:val="30"/>
               </w:rPr>
-              <w:t>0.7629</w:t>
+              <w:t>0.7908</w:t>
             </w:r>
           </w:p>
         </w:tc>
@@ -5841,7 +5773,7 @@
                 <w:i w:val="0"/>
                 <w:sz w:val="30"/>
               </w:rPr>
-              <w:t>0.9119</w:t>
+              <w:t>0.8360</w:t>
             </w:r>
           </w:p>
         </w:tc>
@@ -5857,7 +5789,7 @@
                 <w:i w:val="0"/>
                 <w:sz w:val="30"/>
               </w:rPr>
-              <w:t>0.7170</w:t>
+              <w:t>0.7956</w:t>
             </w:r>
           </w:p>
         </w:tc>
@@ -5869,11 +5801,11 @@
             <w:r>
               <w:rPr>
                 <w:rFonts w:ascii="TH SarabunPSK" w:hAnsi="TH SarabunPSK" w:cs="TH SarabunPSK"/>
-                <w:b w:val="0"/>
-                <w:i w:val="0"/>
-                <w:sz w:val="30"/>
-              </w:rPr>
-              <w:t>0.001</w:t>
+                <w:b/>
+                <w:i w:val="0"/>
+                <w:sz w:val="30"/>
+              </w:rPr>
+              <w:t>0.203</w:t>
             </w:r>
           </w:p>
         </w:tc>
@@ -5887,11 +5819,11 @@
             <w:r>
               <w:rPr>
                 <w:rFonts w:ascii="TH SarabunPSK" w:hAnsi="TH SarabunPSK" w:cs="TH SarabunPSK"/>
-                <w:b w:val="0"/>
-                <w:i w:val="0"/>
-                <w:sz w:val="30"/>
-              </w:rPr>
-              <w:t>Decision Tree</w:t>
+                <w:b/>
+                <w:i w:val="0"/>
+                <w:sz w:val="30"/>
+              </w:rPr>
+              <w:t>Random Forest</w:t>
             </w:r>
           </w:p>
         </w:tc>
@@ -5903,11 +5835,11 @@
             <w:r>
               <w:rPr>
                 <w:rFonts w:ascii="TH SarabunPSK" w:hAnsi="TH SarabunPSK" w:cs="TH SarabunPSK"/>
-                <w:b w:val="0"/>
-                <w:i w:val="0"/>
-                <w:sz w:val="30"/>
-              </w:rPr>
-              <w:t>0.7908</w:t>
+                <w:b/>
+                <w:i w:val="0"/>
+                <w:sz w:val="30"/>
+              </w:rPr>
+              <w:t>0.8422</w:t>
             </w:r>
           </w:p>
         </w:tc>
@@ -5919,11 +5851,11 @@
             <w:r>
               <w:rPr>
                 <w:rFonts w:ascii="TH SarabunPSK" w:hAnsi="TH SarabunPSK" w:cs="TH SarabunPSK"/>
-                <w:b w:val="0"/>
-                <w:i w:val="0"/>
-                <w:sz w:val="30"/>
-              </w:rPr>
-              <w:t>0.8360</w:t>
+                <w:b/>
+                <w:i w:val="0"/>
+                <w:sz w:val="30"/>
+              </w:rPr>
+              <w:t>0.9546</w:t>
             </w:r>
           </w:p>
         </w:tc>
@@ -5939,7 +5871,7 @@
                 <w:i w:val="0"/>
                 <w:sz w:val="30"/>
               </w:rPr>
-              <w:t>0.7956</w:t>
+              <w:t>0.8143</w:t>
             </w:r>
           </w:p>
         </w:tc>
@@ -5951,175 +5883,11 @@
             <w:r>
               <w:rPr>
                 <w:rFonts w:ascii="TH SarabunPSK" w:hAnsi="TH SarabunPSK" w:cs="TH SarabunPSK"/>
-                <w:b/>
-                <w:i w:val="0"/>
-                <w:sz w:val="30"/>
-              </w:rPr>
-              <w:t>0.203</w:t>
-            </w:r>
-          </w:p>
-        </w:tc>
-      </w:tr>
-      <w:tr>
-        <w:tc>
-          <w:tcPr>
-            <w:tcW w:type="dxa" w:w="2736"/>
-          </w:tcPr>
-          <w:p>
-            <w:r>
-              <w:rPr>
-                <w:rFonts w:ascii="TH SarabunPSK" w:hAnsi="TH SarabunPSK" w:cs="TH SarabunPSK"/>
-                <w:b/>
-                <w:i w:val="0"/>
-                <w:sz w:val="30"/>
-              </w:rPr>
-              <w:t>Random Forest</w:t>
-            </w:r>
-          </w:p>
-        </w:tc>
-        <w:tc>
-          <w:tcPr>
-            <w:tcW w:type="dxa" w:w="1440"/>
-          </w:tcPr>
-          <w:p>
-            <w:r>
-              <w:rPr>
-                <w:rFonts w:ascii="TH SarabunPSK" w:hAnsi="TH SarabunPSK" w:cs="TH SarabunPSK"/>
-                <w:b/>
-                <w:i w:val="0"/>
-                <w:sz w:val="30"/>
-              </w:rPr>
-              <w:t>0.8422</w:t>
-            </w:r>
-          </w:p>
-        </w:tc>
-        <w:tc>
-          <w:tcPr>
-            <w:tcW w:type="dxa" w:w="1440"/>
-          </w:tcPr>
-          <w:p>
-            <w:r>
-              <w:rPr>
-                <w:rFonts w:ascii="TH SarabunPSK" w:hAnsi="TH SarabunPSK" w:cs="TH SarabunPSK"/>
-                <w:b/>
-                <w:i w:val="0"/>
-                <w:sz w:val="30"/>
-              </w:rPr>
-              <w:t>0.9546</w:t>
-            </w:r>
-          </w:p>
-        </w:tc>
-        <w:tc>
-          <w:tcPr>
-            <w:tcW w:type="dxa" w:w="1440"/>
-          </w:tcPr>
-          <w:p>
-            <w:r>
-              <w:rPr>
-                <w:rFonts w:ascii="TH SarabunPSK" w:hAnsi="TH SarabunPSK" w:cs="TH SarabunPSK"/>
-                <w:b w:val="0"/>
-                <w:i w:val="0"/>
-                <w:sz w:val="30"/>
-              </w:rPr>
-              <w:t>0.8143</w:t>
-            </w:r>
-          </w:p>
-        </w:tc>
-        <w:tc>
-          <w:tcPr>
-            <w:tcW w:type="dxa" w:w="1728"/>
-          </w:tcPr>
-          <w:p>
-            <w:r>
-              <w:rPr>
-                <w:rFonts w:ascii="TH SarabunPSK" w:hAnsi="TH SarabunPSK" w:cs="TH SarabunPSK"/>
                 <w:b w:val="0"/>
                 <w:i w:val="0"/>
                 <w:sz w:val="30"/>
               </w:rPr>
               <w:t>0.152</w:t>
-            </w:r>
-          </w:p>
-        </w:tc>
-      </w:tr>
-      <w:tr>
-        <w:tc>
-          <w:tcPr>
-            <w:tcW w:type="dxa" w:w="2736"/>
-          </w:tcPr>
-          <w:p>
-            <w:r>
-              <w:rPr>
-                <w:rFonts w:ascii="TH SarabunPSK" w:hAnsi="TH SarabunPSK" w:cs="TH SarabunPSK"/>
-                <w:b w:val="0"/>
-                <w:i w:val="0"/>
-                <w:sz w:val="30"/>
-              </w:rPr>
-              <w:t>HistGradientBoosting</w:t>
-            </w:r>
-          </w:p>
-        </w:tc>
-        <w:tc>
-          <w:tcPr>
-            <w:tcW w:type="dxa" w:w="1440"/>
-          </w:tcPr>
-          <w:p>
-            <w:r>
-              <w:rPr>
-                <w:rFonts w:ascii="TH SarabunPSK" w:hAnsi="TH SarabunPSK" w:cs="TH SarabunPSK"/>
-                <w:b w:val="0"/>
-                <w:i w:val="0"/>
-                <w:sz w:val="30"/>
-              </w:rPr>
-              <w:t>0.8112</w:t>
-            </w:r>
-          </w:p>
-        </w:tc>
-        <w:tc>
-          <w:tcPr>
-            <w:tcW w:type="dxa" w:w="1440"/>
-          </w:tcPr>
-          <w:p>
-            <w:r>
-              <w:rPr>
-                <w:rFonts w:ascii="TH SarabunPSK" w:hAnsi="TH SarabunPSK" w:cs="TH SarabunPSK"/>
-                <w:b w:val="0"/>
-                <w:i w:val="0"/>
-                <w:sz w:val="30"/>
-              </w:rPr>
-              <w:t>0.9417</w:t>
-            </w:r>
-          </w:p>
-        </w:tc>
-        <w:tc>
-          <w:tcPr>
-            <w:tcW w:type="dxa" w:w="1440"/>
-          </w:tcPr>
-          <w:p>
-            <w:r>
-              <w:rPr>
-                <w:rFonts w:ascii="TH SarabunPSK" w:hAnsi="TH SarabunPSK" w:cs="TH SarabunPSK"/>
-                <w:b w:val="0"/>
-                <w:i w:val="0"/>
-                <w:sz w:val="30"/>
-              </w:rPr>
-              <w:t>0.7756</w:t>
-            </w:r>
-          </w:p>
-        </w:tc>
-        <w:tc>
-          <w:tcPr>
-            <w:tcW w:type="dxa" w:w="1728"/>
-          </w:tcPr>
-          <w:p>
-            <w:r>
-              <w:rPr>
-                <w:rFonts w:ascii="TH SarabunPSK" w:hAnsi="TH SarabunPSK" w:cs="TH SarabunPSK"/>
-                <w:b w:val="0"/>
-                <w:i w:val="0"/>
-                <w:sz w:val="30"/>
-              </w:rPr>
-              <w:t>0.011</w:t>
             </w:r>
           </w:p>
         </w:tc>
@@ -6148,7 +5916,7 @@
       <w:r>
         <w:drawing>
           <wp:inline>
-            <wp:extent cx="4572000" cy="1996807"/>
+            <wp:extent cx="4572000" cy="2286000"/>
             <wp:docPr id="9" name="Picture 9"/>
             <wp:cNvGraphicFramePr>
               <a:graphicFrameLocks noChangeAspect="1"/>
@@ -6169,7 +5937,7 @@
                   <pic:spPr>
                     <a:xfrm>
                       <a:off x="0" y="0"/>
-                      <a:ext cx="4572000" cy="1996807"/>
+                      <a:ext cx="4572000" cy="2286000"/>
                     </a:xfrm>
                     <a:prstGeom prst="rect"/>
                   </pic:spPr>
@@ -6192,7 +5960,7 @@
           <w:i/>
           <w:sz w:val="28"/>
         </w:rPr>
-        <w:t>รูปที่ 9  ค่า F1 จาก Cross-Validation ของแบบจำลองทั้ง 5 ชนิด</w:t>
+        <w:t>รูปที่ 9  ค่า F1 จาก Cross-Validation ของแบบจำลองทั้ง 3 ชนิด</w:t>
       </w:r>
     </w:p>
     <w:p>
@@ -6297,7 +6065,7 @@
           <w:i w:val="0"/>
           <w:sz w:val="32"/>
         </w:rPr>
-        <w:t>เนื่องจากข้อมูลไม่สมดุล การใช้ Accuracy เพียงอย่างเดียวจะให้ภาพที่คลาดเคลื่อน ดังเห็นได้จาก Dummy Classifier ที่ได้ Accuracy ร้อยละ 62.92 แต่มีค่า F1 เท่ากับ 0 คือไม่สามารถตรวจจับการยกเลิกได้เลยแม้แต่รายการเดียว</w:t>
+        <w:t>เนื่องจากข้อมูลไม่สมดุล การใช้ Accuracy เพียงอย่างเดียวจะให้ภาพที่คลาดเคลื่อน ดังเห็นได้จากการทำนายว่า "ไม่ยกเลิก" ทุกรายการ ซึ่งได้ค่า Accuracy สูงถึงร้อยละ 62.96 แต่มีค่า F1 เท่ากับ 0 คือไม่สามารถตรวจจับการยกเลิกได้เลยแม้แต่รายการเดียว</w:t>
       </w:r>
     </w:p>
     <w:p>
@@ -6609,88 +6377,6 @@
                 <w:sz w:val="30"/>
               </w:rPr>
               <w:t>0.152 → 0.122</w:t>
-            </w:r>
-          </w:p>
-        </w:tc>
-      </w:tr>
-      <w:tr>
-        <w:tc>
-          <w:tcPr>
-            <w:tcW w:type="dxa" w:w="2448"/>
-          </w:tcPr>
-          <w:p>
-            <w:r>
-              <w:rPr>
-                <w:rFonts w:ascii="TH SarabunPSK" w:hAnsi="TH SarabunPSK" w:cs="TH SarabunPSK"/>
-                <w:b w:val="0"/>
-                <w:i w:val="0"/>
-                <w:sz w:val="30"/>
-              </w:rPr>
-              <w:t>HistGradientBoosting</w:t>
-            </w:r>
-          </w:p>
-        </w:tc>
-        <w:tc>
-          <w:tcPr>
-            <w:tcW w:type="dxa" w:w="1296"/>
-          </w:tcPr>
-          <w:p>
-            <w:r>
-              <w:rPr>
-                <w:rFonts w:ascii="TH SarabunPSK" w:hAnsi="TH SarabunPSK" w:cs="TH SarabunPSK"/>
-                <w:b w:val="0"/>
-                <w:i w:val="0"/>
-                <w:sz w:val="30"/>
-              </w:rPr>
-              <w:t>0.8112</w:t>
-            </w:r>
-          </w:p>
-        </w:tc>
-        <w:tc>
-          <w:tcPr>
-            <w:tcW w:type="dxa" w:w="1296"/>
-          </w:tcPr>
-          <w:p>
-            <w:r>
-              <w:rPr>
-                <w:rFonts w:ascii="TH SarabunPSK" w:hAnsi="TH SarabunPSK" w:cs="TH SarabunPSK"/>
-                <w:b/>
-                <w:i w:val="0"/>
-                <w:sz w:val="30"/>
-              </w:rPr>
-              <w:t>0.8344</w:t>
-            </w:r>
-          </w:p>
-        </w:tc>
-        <w:tc>
-          <w:tcPr>
-            <w:tcW w:type="dxa" w:w="1296"/>
-          </w:tcPr>
-          <w:p>
-            <w:r>
-              <w:rPr>
-                <w:rFonts w:ascii="TH SarabunPSK" w:hAnsi="TH SarabunPSK" w:cs="TH SarabunPSK"/>
-                <w:b w:val="0"/>
-                <w:i w:val="0"/>
-                <w:sz w:val="30"/>
-              </w:rPr>
-              <w:t>+0.0232</w:t>
-            </w:r>
-          </w:p>
-        </w:tc>
-        <w:tc>
-          <w:tcPr>
-            <w:tcW w:type="dxa" w:w="2448"/>
-          </w:tcPr>
-          <w:p>
-            <w:r>
-              <w:rPr>
-                <w:rFonts w:ascii="TH SarabunPSK" w:hAnsi="TH SarabunPSK" w:cs="TH SarabunPSK"/>
-                <w:b w:val="0"/>
-                <w:i w:val="0"/>
-                <w:sz w:val="30"/>
-              </w:rPr>
-              <w:t>0.011 → 0.062</w:t>
             </w:r>
           </w:p>
         </w:tc>
@@ -7303,7 +6989,7 @@
           <w:i w:val="0"/>
           <w:sz w:val="32"/>
         </w:rPr>
-        <w:t>ค่า F1 ของ Random Forest แทบไม่เปลี่ยนแปลง (จาก 0.8422 เป็น 0.8419 ซึ่งน้อยกว่าค่าส่วนเบี่ยงเบนมาตรฐาน จึงถือว่าไม่ต่างกัน) แต่ช่องว่างระหว่างคะแนนชุดฝึกกับ Cross-Validation ลดลงจาก 0.152 เหลือ 0.122 แสดงว่าแบบจำลองจดจำข้อมูลชุดฝึกน้อยลงและมีเสถียรภาพมากขึ้น ส่วน HistGradientBoosting มีค่า F1 เพิ่มขึ้นชัดเจนที่สุดคือ 0.0232 และ Logistic Regression เพิ่มขึ้น 0.0155 จากการใช้ class_weight แบบ balanced</w:t>
+        <w:t>ค่า F1 ของ Random Forest แทบไม่เปลี่ยนแปลง (จาก 0.8422 เป็น 0.8419 ซึ่งน้อยกว่าค่าส่วนเบี่ยงเบนมาตรฐาน จึงถือว่าไม่ต่างกัน) แต่ช่องว่างระหว่างคะแนนชุดฝึกกับ Cross-Validation ลดลงจาก 0.152 เหลือ 0.122 แสดงว่าแบบจำลองจดจำข้อมูลชุดฝึกน้อยลงและมีเสถียรภาพมากขึ้น ส่วน Logistic Regression มีค่า F1 เพิ่มขึ้น 0.0155 จากการใช้ class_weight แบบ balanced ซึ่งช่วยชดเชยความไม่สมดุลของคลาส</w:t>
       </w:r>
     </w:p>
     <w:p>
@@ -7799,7 +7485,7 @@
           <w:i w:val="0"/>
           <w:sz w:val="32"/>
         </w:rPr>
-        <w:t>แบบจำลองมีค่า Recall สูงถึง 0.8590 คือตรวจจับการจองที่จะถูกยกเลิกได้เกือบร้อยละ 86 และมีค่า ROC-AUC 0.9567 แสดงว่าสามารถแยกสองคลาสออกจากกันได้ดีมาก โดยชนะเกณฑ์ขั้นต่ำ (Dummy ที่มี F1 = 0) อย่างชัดเจน</w:t>
+        <w:t>แบบจำลองมีค่า Recall สูงถึง 0.8590 คือตรวจจับการจองที่จะถูกยกเลิกได้เกือบร้อยละ 86 และมีค่า ROC-AUC 0.9567 แสดงว่าสามารถแยกสองคลาสออกจากกันได้ดีมาก โดยชนะเกณฑ์ขั้นต่ำซึ่งได้ค่า F1 เท่ากับ 0 อย่างชัดเจน</w:t>
       </w:r>
     </w:p>
     <w:p>
@@ -9313,104 +8999,6 @@
           </w:p>
         </w:tc>
       </w:tr>
-      <w:tr>
-        <w:tc>
-          <w:tcPr>
-            <w:tcW w:type="dxa" w:w="2736"/>
-          </w:tcPr>
-          <w:p>
-            <w:r>
-              <w:rPr>
-                <w:rFonts w:ascii="TH SarabunPSK" w:hAnsi="TH SarabunPSK" w:cs="TH SarabunPSK"/>
-                <w:b w:val="0"/>
-                <w:i w:val="0"/>
-                <w:sz w:val="30"/>
-              </w:rPr>
-              <w:t>HistGradientBoosting</w:t>
-            </w:r>
-          </w:p>
-        </w:tc>
-        <w:tc>
-          <w:tcPr>
-            <w:tcW w:type="dxa" w:w="1440"/>
-          </w:tcPr>
-          <w:p>
-            <w:r>
-              <w:rPr>
-                <w:rFonts w:ascii="TH SarabunPSK" w:hAnsi="TH SarabunPSK" w:cs="TH SarabunPSK"/>
-                <w:b w:val="0"/>
-                <w:i w:val="0"/>
-                <w:sz w:val="30"/>
-              </w:rPr>
-              <w:t>0.8355</w:t>
-            </w:r>
-          </w:p>
-        </w:tc>
-        <w:tc>
-          <w:tcPr>
-            <w:tcW w:type="dxa" w:w="1440"/>
-          </w:tcPr>
-          <w:p>
-            <w:r>
-              <w:rPr>
-                <w:rFonts w:ascii="TH SarabunPSK" w:hAnsi="TH SarabunPSK" w:cs="TH SarabunPSK"/>
-                <w:b w:val="0"/>
-                <w:i w:val="0"/>
-                <w:sz w:val="30"/>
-              </w:rPr>
-              <w:t>0.8116</w:t>
-            </w:r>
-          </w:p>
-        </w:tc>
-        <w:tc>
-          <w:tcPr>
-            <w:tcW w:type="dxa" w:w="1296"/>
-          </w:tcPr>
-          <w:p>
-            <w:r>
-              <w:rPr>
-                <w:rFonts w:ascii="TH SarabunPSK" w:hAnsi="TH SarabunPSK" w:cs="TH SarabunPSK"/>
-                <w:b w:val="0"/>
-                <w:i w:val="0"/>
-                <w:sz w:val="30"/>
-              </w:rPr>
-              <w:t>0.8610</w:t>
-            </w:r>
-          </w:p>
-        </w:tc>
-        <w:tc>
-          <w:tcPr>
-            <w:tcW w:type="dxa" w:w="1440"/>
-          </w:tcPr>
-          <w:p>
-            <w:r>
-              <w:rPr>
-                <w:rFonts w:ascii="TH SarabunPSK" w:hAnsi="TH SarabunPSK" w:cs="TH SarabunPSK"/>
-                <w:b w:val="0"/>
-                <w:i w:val="0"/>
-                <w:sz w:val="30"/>
-              </w:rPr>
-              <w:t>0.9524</w:t>
-            </w:r>
-          </w:p>
-        </w:tc>
-        <w:tc>
-          <w:tcPr>
-            <w:tcW w:type="dxa" w:w="1728"/>
-          </w:tcPr>
-          <w:p>
-            <w:r>
-              <w:rPr>
-                <w:rFonts w:ascii="TH SarabunPSK" w:hAnsi="TH SarabunPSK" w:cs="TH SarabunPSK"/>
-                <w:b w:val="0"/>
-                <w:i w:val="0"/>
-                <w:sz w:val="30"/>
-              </w:rPr>
-              <w:t>2.9</w:t>
-            </w:r>
-          </w:p>
-        </w:tc>
-      </w:tr>
     </w:tbl>
     <w:p>
       <w:pPr>
@@ -9438,7 +9026,7 @@
           <w:i w:val="0"/>
           <w:sz w:val="32"/>
         </w:rPr>
-        <w:t>Random Forest ให้ค่า F1 และ ROC-AUC สูงที่สุด จึงเลือกเป็นแบบจำลองสุดท้ายของโครงงาน ส่วน HistGradientBoosting ให้ผลใกล้เคียงกัน (ต่ำกว่า 0.0114) แต่ใช้เวลาฝึกน้อยกว่าและไฟล์เล็กกว่ามาก จึงถูกเลือกไปใช้ในส่วนของเว็บแอปพลิเคชันแทน ส่วน Logistic Regression แม้จะตีความง่ายที่สุด แต่ค่า F1 ต่ำกว่าอย่างมีนัยสำคัญเพราะไม่สามารถจับความสัมพันธ์ที่ไม่เป็นเส้นตรงได้</w:t>
+        <w:t>Random Forest ให้ค่า F1 และ ROC-AUC สูงที่สุด จึงเลือกเป็นแบบจำลองสุดท้ายของโครงงาน ส่วน Logistic Regression แม้จะตีความง่ายที่สุดและไม่เกิด Overfitting แต่ค่า F1 ต่ำกว่าถึง 0.0687 เพราะเป็นแบบจำลองเชิงเส้นที่จับความสัมพันธ์ไม่เป็นเส้นตรง และปฏิสัมพันธ์ระหว่างตัวแปรไม่ได้ ส่วน Decision Tree แม้จะจับรูปแบบไม่เป็นเส้นตรงได้ แต่มีปัญหา Overfitting รุนแรงที่สุด (ช่องว่าง 0.203)</w:t>
       </w:r>
     </w:p>
     <w:p>
@@ -9535,7 +9123,7 @@
           <w:i w:val="0"/>
           <w:sz w:val="32"/>
         </w:rPr>
-        <w:t>แบบจำลองที่ใช้บนเว็บคือ HistGradientBoosting ซึ่งมีขนาดไฟล์ 0.8 เมกะไบต์ แทน Random Forest ที่มีขนาด 356.8 เมกะไบต์ เนื่องจากบริการโฮสต์แบบไม่มีค่าใช้จ่ายจำกัดหน่วยความจำไว้ โดยยอมแลกค่า F1 ที่ลดลง 0.0135 (จาก 0.8469 เหลือ 0.8334) เพื่อให้ระบบใช้งานได้จริง</w:t>
+        <w:t>แบบจำลองที่ใช้บนเว็บเป็น Random Forest ฉบับย่อ ซึ่งลดจำนวนต้นไม้เหลือ 150 ต้น จำกัดความลึกสูงสุดที่ 25 และกำหนดจำนวนข้อมูลขั้นต่ำต่อใบเป็น 5 ทำให้ไฟล์มีขนาด 28.8 เมกะไบต์ แทนที่จะเป็น 356.8 เมกะไบต์ของแบบจำลองเต็ม เนื่องจากบริการโฮสต์แบบไม่มีค่าใช้จ่ายจำกัดหน่วยความจำไว้ และ GitHub จำกัดขนาดไฟล์ไว้ที่ 100 เมกะไบต์ โดยยอมแลกค่า F1 ที่ลดลง 0.0093 (จาก 0.8469 เหลือ 0.8376) เพื่อให้ระบบใช้งานได้จริง ค่า Threshold ของแบบจำลองนี้คำนวณใหม่ได้เท่ากับ 0.4754</w:t>
       </w:r>
     </w:p>
     <w:p>
@@ -9665,7 +9253,7 @@
                 <w:i w:val="0"/>
                 <w:sz w:val="30"/>
               </w:rPr>
-              <w:t>ร้อยละ 99.8</w:t>
+              <w:t>ร้อยละ 100.0</w:t>
             </w:r>
           </w:p>
         </w:tc>
@@ -9715,7 +9303,7 @@
                 <w:i w:val="0"/>
                 <w:sz w:val="30"/>
               </w:rPr>
-              <w:t>ร้อยละ 25.9</w:t>
+              <w:t>ร้อยละ 33.3</w:t>
             </w:r>
           </w:p>
         </w:tc>
@@ -9765,7 +9353,7 @@
                 <w:i w:val="0"/>
                 <w:sz w:val="30"/>
               </w:rPr>
-              <w:t>ร้อยละ 1.0</w:t>
+              <w:t>ร้อยละ 0.6</w:t>
             </w:r>
           </w:p>
         </w:tc>
@@ -9900,7 +9488,7 @@
           <w:i w:val="0"/>
           <w:sz w:val="32"/>
         </w:rPr>
-        <w:t>•  แบบจำลองบนเว็บเป็นคนละตัวกับแบบจำลองที่ให้ผลดีที่สุดในรายงาน เนื่องจากข้อจำกัดด้านขนาดไฟล์และหน่วยความจำ</w:t>
+        <w:t>•  แบบจำลองบนเว็บเป็น Random Forest ฉบับย่อซึ่งมีค่า F1 ต่ำกว่าแบบจำลองเต็มในรายงาน 0.0093 เนื่องจากข้อจำกัดด้านขนาดไฟล์และหน่วยความจำของบริการโฮสต์</w:t>
       </w:r>
     </w:p>
     <w:p>
@@ -10099,7 +9687,7 @@
           <w:i w:val="0"/>
           <w:sz w:val="32"/>
         </w:rPr>
-        <w:t>โครงงานนี้พัฒนาแบบจำลองสำหรับทำนายการยกเลิกการจองโรงแรมจากข้อมูลจริง 119,208 รายการ โดยผ่านกระบวนการตั้งแต่การสำรวจข้อมูล การทำความสะอาด การสร้างตัวแปรใหม่ 9 ตัว การคัดเลือกตัวแปรจาก 37 ตัวเหลือ 18 ตัวด้วยการลงคะแนนจาก 3 วิธี การเปรียบเทียบแบบจำลอง 5 ชนิด และการปรับ Hyperparameter แบบจำลองที่ดีที่สุดคือ Random Forest ซึ่งให้ค่า F1 เท่ากับ 0.8469 Precision 0.8351 Recall 0.8590 และ ROC-AUC 0.9567 บนชุดทดสอบที่ไม่เคยถูกใช้มาก่อน</w:t>
+        <w:t>โครงงานนี้พัฒนาแบบจำลองสำหรับทำนายการยกเลิกการจองโรงแรมจากข้อมูลจริง 119,208 รายการ โดยผ่านกระบวนการตั้งแต่การสำรวจข้อมูล การทำความสะอาด การสร้างตัวแปรใหม่ 9 ตัว การคัดเลือกตัวแปรจาก 37 ตัวเหลือ 18 ตัวด้วยการลงคะแนนจาก 3 วิธี การเปรียบเทียบแบบจำลอง 3 ชนิด และการปรับ Hyperparameter แบบจำลองที่ดีที่สุดคือ Random Forest ซึ่งให้ค่า F1 เท่ากับ 0.8469 Precision 0.8351 Recall 0.8590 และ ROC-AUC 0.9567 บนชุดทดสอบที่ไม่เคยถูกใช้มาก่อน</w:t>
       </w:r>
     </w:p>
     <w:p>
@@ -10139,7 +9727,7 @@
           <w:i w:val="0"/>
           <w:sz w:val="32"/>
         </w:rPr>
-        <w:t>ถือว่าตอบโจทย์ที่ตั้งไว้ เนื่องจากแบบจำลองสามารถทำนายการยกเลิกได้ดีกว่าเกณฑ์ขั้นต่ำอย่างชัดเจน (Dummy Classifier มีค่า F1 เท่ากับ 0) และสามารถระบุปัจจัยเสี่ยงหลักได้ ได้แก่ ประเภทเงินมัดจำ เอเจนต์ที่ทำการจอง ระยะเวลาจองล่วงหน้า ประเทศของลูกค้า และจำนวนคำขอพิเศษ ซึ่งโรงแรมสามารถนำไปกำหนดนโยบายรับมือได้</w:t>
+        <w:t>ถือว่าตอบโจทย์ที่ตั้งไว้ เนื่องจากแบบจำลองสามารถทำนายการยกเลิกได้ดีกว่าเกณฑ์ขั้นต่ำอย่างชัดเจน (การทายว่าไม่ยกเลิกทุกรายการได้ค่า F1 เท่ากับ 0) และสามารถระบุปัจจัยเสี่ยงหลักได้ ได้แก่ ประเภทเงินมัดจำ เอเจนต์ที่ทำการจอง ระยะเวลาจองล่วงหน้า ประเทศของลูกค้า และจำนวนคำขอพิเศษ ซึ่งโรงแรมสามารถนำไปกำหนดนโยบายรับมือได้</w:t>
       </w:r>
     </w:p>
     <w:p>

</xml_diff>

<commit_message>
Revert "Drop Dummy and HistGradientBoosting from the whole project"
This reverts commit 3b1f2a86e98d934c4218596878dfd3434eddf85b.
</commit_message>
<xml_diff>
--- a/docs/รายงานโครงงาน-Hotel-Booking-Cancellation-Prediction.docx
+++ b/docs/รายงานโครงงาน-Hotel-Booking-Cancellation-Prediction.docx
@@ -4639,7 +4639,7 @@
           <w:i w:val="0"/>
           <w:sz w:val="32"/>
         </w:rPr>
-        <w:t>เปรียบเทียบชุดตัวแปร 3 ชุดด้วยแบบจำลองเดียวกัน (Random Forest ค่าเริ่มต้น) และวิธี Cross-Validation แบบเดียวกัน โดยเปลี่ยนเฉพาะชุดตัวแปร</w:t>
+        <w:t>เปรียบเทียบชุดตัวแปร 3 ชุดด้วยแบบจำลองเดียวกัน (HistGradientBoosting ค่าเริ่มต้น) และวิธี Cross-Validation แบบเดียวกัน โดยเปลี่ยนเฉพาะชุดตัวแปร</w:t>
       </w:r>
     </w:p>
     <w:tbl>
@@ -4795,7 +4795,7 @@
                 <w:i w:val="0"/>
                 <w:sz w:val="30"/>
               </w:rPr>
-              <w:t>0.8416 ± 0.0037</w:t>
+              <w:t>0.8103 ± 0.0049</w:t>
             </w:r>
           </w:p>
         </w:tc>
@@ -4811,7 +4811,7 @@
                 <w:i w:val="0"/>
                 <w:sz w:val="30"/>
               </w:rPr>
-              <w:t>0.9551</w:t>
+              <w:t>0.9420</w:t>
             </w:r>
           </w:p>
         </w:tc>
@@ -4827,7 +4827,7 @@
                 <w:i w:val="0"/>
                 <w:sz w:val="30"/>
               </w:rPr>
-              <w:t>0.9367</w:t>
+              <w:t>0.9157</w:t>
             </w:r>
           </w:p>
         </w:tc>
@@ -4877,7 +4877,7 @@
                 <w:i w:val="0"/>
                 <w:sz w:val="30"/>
               </w:rPr>
-              <w:t>0.8427 ± 0.0028</w:t>
+              <w:t>0.8127 ± 0.0042</w:t>
             </w:r>
           </w:p>
         </w:tc>
@@ -4893,7 +4893,7 @@
                 <w:i w:val="0"/>
                 <w:sz w:val="30"/>
               </w:rPr>
-              <w:t>0.9554</w:t>
+              <w:t>0.9428</w:t>
             </w:r>
           </w:p>
         </w:tc>
@@ -4909,7 +4909,7 @@
                 <w:i w:val="0"/>
                 <w:sz w:val="30"/>
               </w:rPr>
-              <w:t>0.9372</w:t>
+              <w:t>0.9165</w:t>
             </w:r>
           </w:p>
         </w:tc>
@@ -4959,7 +4959,7 @@
                 <w:i w:val="0"/>
                 <w:sz w:val="30"/>
               </w:rPr>
-              <w:t>0.8421 ± 0.0036</w:t>
+              <w:t>0.8112 ± 0.0027</w:t>
             </w:r>
           </w:p>
         </w:tc>
@@ -4975,7 +4975,7 @@
                 <w:i w:val="0"/>
                 <w:sz w:val="30"/>
               </w:rPr>
-              <w:t>0.9546</w:t>
+              <w:t>0.9417</w:t>
             </w:r>
           </w:p>
         </w:tc>
@@ -4991,7 +4991,7 @@
                 <w:i w:val="0"/>
                 <w:sz w:val="30"/>
               </w:rPr>
-              <w:t>0.9358</w:t>
+              <w:t>0.9154</w:t>
             </w:r>
           </w:p>
         </w:tc>
@@ -5023,7 +5023,7 @@
           <w:i w:val="0"/>
           <w:sz w:val="32"/>
         </w:rPr>
-        <w:t>ผลต่างของค่า F1 ระหว่างชุด B และ C เท่ากับ 0.0006 ซึ่งน้อยกว่าค่าส่วนเบี่ยงเบนมาตรฐาน (0.0028) จึงถือว่าไม่แตกต่างกันอย่างมีนัยสำคัญ แต่ชุด C ใช้ตัวแปรเพียงครึ่งเดียวของชุด B และใช้เวลาฝึกเพียง 8.7 วินาที เทียบกับ 17.5 วินาทีของชุด B คือเร็วขึ้นประมาณเท่าตัว คณะผู้จัดทำจึงเลือกชุด C เป็นชุดตัวแปรสำหรับพัฒนาแบบจำลอง</w:t>
+        <w:t>ผลต่างของค่า F1 ระหว่างชุด B และ C เท่ากับ 0.0015 ซึ่งน้อยกว่าค่าส่วนเบี่ยงเบนมาตรฐาน (0.0042) จึงถือว่าไม่แตกต่างกันอย่างมีนัยสำคัญ แต่ชุด C ใช้ตัวแปรเพียงครึ่งเดียว มีค่าส่วนเบี่ยงเบนมาตรฐานต่ำที่สุดคือเสถียรที่สุด และใช้เวลาฝึกน้อยที่สุด คณะผู้จัดทำจึงเลือกชุด C เป็นชุดตัวแปรสำหรับพัฒนาแบบจำลอง</w:t>
       </w:r>
     </w:p>
     <w:p>
@@ -5034,7 +5034,7 @@
       <w:r>
         <w:drawing>
           <wp:inline>
-            <wp:extent cx="4389120" cy="2438400"/>
+            <wp:extent cx="4389120" cy="2397669"/>
             <wp:docPr id="8" name="Picture 8"/>
             <wp:cNvGraphicFramePr>
               <a:graphicFrameLocks noChangeAspect="1"/>
@@ -5055,7 +5055,7 @@
                   <pic:spPr>
                     <a:xfrm>
                       <a:off x="0" y="0"/>
-                      <a:ext cx="4389120" cy="2438400"/>
+                      <a:ext cx="4389120" cy="2397669"/>
                     </a:xfrm>
                     <a:prstGeom prst="rect"/>
                   </pic:spPr>
@@ -5078,7 +5078,7 @@
           <w:i/>
           <w:sz w:val="28"/>
         </w:rPr>
-        <w:t>รูปที่ 8  ค่า F1 (Random Forest) เมื่อเพิ่มจำนวนตัวแปร (K) ตามลำดับความสำคัญ ใช้ประกอบการเลือก K = 18</w:t>
+        <w:t>รูปที่ 8  ค่า F1 เมื่อเพิ่มจำนวนตัวแปร (K) ตามลำดับความสำคัญ ใช้ประกอบการเลือก K = 18</w:t>
       </w:r>
     </w:p>
     <w:p>
@@ -5161,7 +5161,7 @@
           <w:i w:val="0"/>
           <w:sz w:val="32"/>
         </w:rPr>
-        <w:t>เลือกเปรียบเทียบแบบจำลอง 3 ชนิด เรียงจากง่ายไปซับซ้อน เพื่อให้เห็นว่าความซับซ้อนที่เพิ่มขึ้น ให้ผลลัพธ์ที่ดีขึ้นจริงหรือไม่</w:t>
+        <w:t>เลือกเปรียบเทียบแบบจำลอง 5 ชนิด เรียงจากง่ายไปซับซ้อน เพื่อให้เห็นว่าความซับซ้อนที่เพิ่มขึ้น ให้ผลลัพธ์ที่ดีขึ้นจริงหรือไม่</w:t>
       </w:r>
     </w:p>
     <w:tbl>
@@ -5231,7 +5231,7 @@
                 <w:i w:val="0"/>
                 <w:sz w:val="30"/>
               </w:rPr>
-              <w:t>Logistic Regression</w:t>
+              <w:t>Dummy Classifier</w:t>
             </w:r>
           </w:p>
         </w:tc>
@@ -5247,7 +5247,7 @@
                 <w:i w:val="0"/>
                 <w:sz w:val="30"/>
               </w:rPr>
-              <w:t>แบบจำลองเชิงเส้น ตีความง่าย ใช้เป็นฐานเปรียบเทียบ</w:t>
+              <w:t>เกณฑ์ขั้นต่ำ ทำนายคลาสที่พบบ่อยที่สุดเสมอ</w:t>
             </w:r>
           </w:p>
         </w:tc>
@@ -5265,7 +5265,7 @@
                 <w:i w:val="0"/>
                 <w:sz w:val="30"/>
               </w:rPr>
-              <w:t>Decision Tree</w:t>
+              <w:t>Logistic Regression</w:t>
             </w:r>
           </w:p>
         </w:tc>
@@ -5281,7 +5281,7 @@
                 <w:i w:val="0"/>
                 <w:sz w:val="30"/>
               </w:rPr>
-              <w:t>ต้นไม้เดี่ยว ใช้แสดงปัญหา Overfitting ให้เห็นชัด</w:t>
+              <w:t>แบบจำลองเชิงเส้น ตีความง่าย ใช้เป็นฐานเปรียบเทียบ</w:t>
             </w:r>
           </w:p>
         </w:tc>
@@ -5299,6 +5299,40 @@
                 <w:i w:val="0"/>
                 <w:sz w:val="30"/>
               </w:rPr>
+              <w:t>Decision Tree</w:t>
+            </w:r>
+          </w:p>
+        </w:tc>
+        <w:tc>
+          <w:tcPr>
+            <w:tcW w:type="dxa" w:w="5760"/>
+          </w:tcPr>
+          <w:p>
+            <w:r>
+              <w:rPr>
+                <w:rFonts w:ascii="TH SarabunPSK" w:hAnsi="TH SarabunPSK" w:cs="TH SarabunPSK"/>
+                <w:b w:val="0"/>
+                <w:i w:val="0"/>
+                <w:sz w:val="30"/>
+              </w:rPr>
+              <w:t>ต้นไม้เดี่ยว ใช้แสดงปัญหา Overfitting ให้เห็นชัด</w:t>
+            </w:r>
+          </w:p>
+        </w:tc>
+      </w:tr>
+      <w:tr>
+        <w:tc>
+          <w:tcPr>
+            <w:tcW w:type="dxa" w:w="2880"/>
+          </w:tcPr>
+          <w:p>
+            <w:r>
+              <w:rPr>
+                <w:rFonts w:ascii="TH SarabunPSK" w:hAnsi="TH SarabunPSK" w:cs="TH SarabunPSK"/>
+                <w:b w:val="0"/>
+                <w:i w:val="0"/>
+                <w:sz w:val="30"/>
+              </w:rPr>
               <w:t>Random Forest</w:t>
             </w:r>
           </w:p>
@@ -5316,6 +5350,40 @@
                 <w:sz w:val="30"/>
               </w:rPr>
               <w:t>Ensemble แบบ Bagging ลดความแปรปรวนของต้นไม้เดี่ยว</w:t>
+            </w:r>
+          </w:p>
+        </w:tc>
+      </w:tr>
+      <w:tr>
+        <w:tc>
+          <w:tcPr>
+            <w:tcW w:type="dxa" w:w="2880"/>
+          </w:tcPr>
+          <w:p>
+            <w:r>
+              <w:rPr>
+                <w:rFonts w:ascii="TH SarabunPSK" w:hAnsi="TH SarabunPSK" w:cs="TH SarabunPSK"/>
+                <w:b w:val="0"/>
+                <w:i w:val="0"/>
+                <w:sz w:val="30"/>
+              </w:rPr>
+              <w:t>HistGradientBoosting</w:t>
+            </w:r>
+          </w:p>
+        </w:tc>
+        <w:tc>
+          <w:tcPr>
+            <w:tcW w:type="dxa" w:w="5760"/>
+          </w:tcPr>
+          <w:p>
+            <w:r>
+              <w:rPr>
+                <w:rFonts w:ascii="TH SarabunPSK" w:hAnsi="TH SarabunPSK" w:cs="TH SarabunPSK"/>
+                <w:b w:val="0"/>
+                <w:i w:val="0"/>
+                <w:sz w:val="30"/>
+              </w:rPr>
+              <w:t>Ensemble แบบ Boosting ทำงานเร็วและเหมาะกับข้อมูลขนาดใหญ่</w:t>
             </w:r>
           </w:p>
         </w:tc>
@@ -5659,7 +5727,7 @@
                 <w:i w:val="0"/>
                 <w:sz w:val="30"/>
               </w:rPr>
-              <w:t>Logistic Regression</w:t>
+              <w:t>Dummy</w:t>
             </w:r>
           </w:p>
         </w:tc>
@@ -5675,7 +5743,7 @@
                 <w:i w:val="0"/>
                 <w:sz w:val="30"/>
               </w:rPr>
-              <w:t>0.7629</w:t>
+              <w:t>0.0000</w:t>
             </w:r>
           </w:p>
         </w:tc>
@@ -5691,7 +5759,7 @@
                 <w:i w:val="0"/>
                 <w:sz w:val="30"/>
               </w:rPr>
-              <w:t>0.9119</w:t>
+              <w:t>0.5000</w:t>
             </w:r>
           </w:p>
         </w:tc>
@@ -5707,7 +5775,7 @@
                 <w:i w:val="0"/>
                 <w:sz w:val="30"/>
               </w:rPr>
-              <w:t>0.7170</w:t>
+              <w:t>0.0000</w:t>
             </w:r>
           </w:p>
         </w:tc>
@@ -5723,7 +5791,7 @@
                 <w:i w:val="0"/>
                 <w:sz w:val="30"/>
               </w:rPr>
-              <w:t>0.001</w:t>
+              <w:t>0.000</w:t>
             </w:r>
           </w:p>
         </w:tc>
@@ -5741,7 +5809,7 @@
                 <w:i w:val="0"/>
                 <w:sz w:val="30"/>
               </w:rPr>
-              <w:t>Decision Tree</w:t>
+              <w:t>Logistic Regression</w:t>
             </w:r>
           </w:p>
         </w:tc>
@@ -5757,7 +5825,7 @@
                 <w:i w:val="0"/>
                 <w:sz w:val="30"/>
               </w:rPr>
-              <w:t>0.7908</w:t>
+              <w:t>0.7629</w:t>
             </w:r>
           </w:p>
         </w:tc>
@@ -5773,7 +5841,7 @@
                 <w:i w:val="0"/>
                 <w:sz w:val="30"/>
               </w:rPr>
-              <w:t>0.8360</w:t>
+              <w:t>0.9119</w:t>
             </w:r>
           </w:p>
         </w:tc>
@@ -5789,7 +5857,7 @@
                 <w:i w:val="0"/>
                 <w:sz w:val="30"/>
               </w:rPr>
-              <w:t>0.7956</w:t>
+              <w:t>0.7170</w:t>
             </w:r>
           </w:p>
         </w:tc>
@@ -5801,11 +5869,11 @@
             <w:r>
               <w:rPr>
                 <w:rFonts w:ascii="TH SarabunPSK" w:hAnsi="TH SarabunPSK" w:cs="TH SarabunPSK"/>
-                <w:b/>
-                <w:i w:val="0"/>
-                <w:sz w:val="30"/>
-              </w:rPr>
-              <w:t>0.203</w:t>
+                <w:b w:val="0"/>
+                <w:i w:val="0"/>
+                <w:sz w:val="30"/>
+              </w:rPr>
+              <w:t>0.001</w:t>
             </w:r>
           </w:p>
         </w:tc>
@@ -5819,10 +5887,92 @@
             <w:r>
               <w:rPr>
                 <w:rFonts w:ascii="TH SarabunPSK" w:hAnsi="TH SarabunPSK" w:cs="TH SarabunPSK"/>
+                <w:b w:val="0"/>
+                <w:i w:val="0"/>
+                <w:sz w:val="30"/>
+              </w:rPr>
+              <w:t>Decision Tree</w:t>
+            </w:r>
+          </w:p>
+        </w:tc>
+        <w:tc>
+          <w:tcPr>
+            <w:tcW w:type="dxa" w:w="1440"/>
+          </w:tcPr>
+          <w:p>
+            <w:r>
+              <w:rPr>
+                <w:rFonts w:ascii="TH SarabunPSK" w:hAnsi="TH SarabunPSK" w:cs="TH SarabunPSK"/>
+                <w:b w:val="0"/>
+                <w:i w:val="0"/>
+                <w:sz w:val="30"/>
+              </w:rPr>
+              <w:t>0.7908</w:t>
+            </w:r>
+          </w:p>
+        </w:tc>
+        <w:tc>
+          <w:tcPr>
+            <w:tcW w:type="dxa" w:w="1440"/>
+          </w:tcPr>
+          <w:p>
+            <w:r>
+              <w:rPr>
+                <w:rFonts w:ascii="TH SarabunPSK" w:hAnsi="TH SarabunPSK" w:cs="TH SarabunPSK"/>
+                <w:b w:val="0"/>
+                <w:i w:val="0"/>
+                <w:sz w:val="30"/>
+              </w:rPr>
+              <w:t>0.8360</w:t>
+            </w:r>
+          </w:p>
+        </w:tc>
+        <w:tc>
+          <w:tcPr>
+            <w:tcW w:type="dxa" w:w="1440"/>
+          </w:tcPr>
+          <w:p>
+            <w:r>
+              <w:rPr>
+                <w:rFonts w:ascii="TH SarabunPSK" w:hAnsi="TH SarabunPSK" w:cs="TH SarabunPSK"/>
+                <w:b w:val="0"/>
+                <w:i w:val="0"/>
+                <w:sz w:val="30"/>
+              </w:rPr>
+              <w:t>0.7956</w:t>
+            </w:r>
+          </w:p>
+        </w:tc>
+        <w:tc>
+          <w:tcPr>
+            <w:tcW w:type="dxa" w:w="1728"/>
+          </w:tcPr>
+          <w:p>
+            <w:r>
+              <w:rPr>
+                <w:rFonts w:ascii="TH SarabunPSK" w:hAnsi="TH SarabunPSK" w:cs="TH SarabunPSK"/>
                 <w:b/>
                 <w:i w:val="0"/>
                 <w:sz w:val="30"/>
               </w:rPr>
+              <w:t>0.203</w:t>
+            </w:r>
+          </w:p>
+        </w:tc>
+      </w:tr>
+      <w:tr>
+        <w:tc>
+          <w:tcPr>
+            <w:tcW w:type="dxa" w:w="2736"/>
+          </w:tcPr>
+          <w:p>
+            <w:r>
+              <w:rPr>
+                <w:rFonts w:ascii="TH SarabunPSK" w:hAnsi="TH SarabunPSK" w:cs="TH SarabunPSK"/>
+                <w:b/>
+                <w:i w:val="0"/>
+                <w:sz w:val="30"/>
+              </w:rPr>
               <w:t>Random Forest</w:t>
             </w:r>
           </w:p>
@@ -5888,6 +6038,88 @@
                 <w:sz w:val="30"/>
               </w:rPr>
               <w:t>0.152</w:t>
+            </w:r>
+          </w:p>
+        </w:tc>
+      </w:tr>
+      <w:tr>
+        <w:tc>
+          <w:tcPr>
+            <w:tcW w:type="dxa" w:w="2736"/>
+          </w:tcPr>
+          <w:p>
+            <w:r>
+              <w:rPr>
+                <w:rFonts w:ascii="TH SarabunPSK" w:hAnsi="TH SarabunPSK" w:cs="TH SarabunPSK"/>
+                <w:b w:val="0"/>
+                <w:i w:val="0"/>
+                <w:sz w:val="30"/>
+              </w:rPr>
+              <w:t>HistGradientBoosting</w:t>
+            </w:r>
+          </w:p>
+        </w:tc>
+        <w:tc>
+          <w:tcPr>
+            <w:tcW w:type="dxa" w:w="1440"/>
+          </w:tcPr>
+          <w:p>
+            <w:r>
+              <w:rPr>
+                <w:rFonts w:ascii="TH SarabunPSK" w:hAnsi="TH SarabunPSK" w:cs="TH SarabunPSK"/>
+                <w:b w:val="0"/>
+                <w:i w:val="0"/>
+                <w:sz w:val="30"/>
+              </w:rPr>
+              <w:t>0.8112</w:t>
+            </w:r>
+          </w:p>
+        </w:tc>
+        <w:tc>
+          <w:tcPr>
+            <w:tcW w:type="dxa" w:w="1440"/>
+          </w:tcPr>
+          <w:p>
+            <w:r>
+              <w:rPr>
+                <w:rFonts w:ascii="TH SarabunPSK" w:hAnsi="TH SarabunPSK" w:cs="TH SarabunPSK"/>
+                <w:b w:val="0"/>
+                <w:i w:val="0"/>
+                <w:sz w:val="30"/>
+              </w:rPr>
+              <w:t>0.9417</w:t>
+            </w:r>
+          </w:p>
+        </w:tc>
+        <w:tc>
+          <w:tcPr>
+            <w:tcW w:type="dxa" w:w="1440"/>
+          </w:tcPr>
+          <w:p>
+            <w:r>
+              <w:rPr>
+                <w:rFonts w:ascii="TH SarabunPSK" w:hAnsi="TH SarabunPSK" w:cs="TH SarabunPSK"/>
+                <w:b w:val="0"/>
+                <w:i w:val="0"/>
+                <w:sz w:val="30"/>
+              </w:rPr>
+              <w:t>0.7756</w:t>
+            </w:r>
+          </w:p>
+        </w:tc>
+        <w:tc>
+          <w:tcPr>
+            <w:tcW w:type="dxa" w:w="1728"/>
+          </w:tcPr>
+          <w:p>
+            <w:r>
+              <w:rPr>
+                <w:rFonts w:ascii="TH SarabunPSK" w:hAnsi="TH SarabunPSK" w:cs="TH SarabunPSK"/>
+                <w:b w:val="0"/>
+                <w:i w:val="0"/>
+                <w:sz w:val="30"/>
+              </w:rPr>
+              <w:t>0.011</w:t>
             </w:r>
           </w:p>
         </w:tc>
@@ -5916,7 +6148,7 @@
       <w:r>
         <w:drawing>
           <wp:inline>
-            <wp:extent cx="4572000" cy="2286000"/>
+            <wp:extent cx="4572000" cy="1996807"/>
             <wp:docPr id="9" name="Picture 9"/>
             <wp:cNvGraphicFramePr>
               <a:graphicFrameLocks noChangeAspect="1"/>
@@ -5937,7 +6169,7 @@
                   <pic:spPr>
                     <a:xfrm>
                       <a:off x="0" y="0"/>
-                      <a:ext cx="4572000" cy="2286000"/>
+                      <a:ext cx="4572000" cy="1996807"/>
                     </a:xfrm>
                     <a:prstGeom prst="rect"/>
                   </pic:spPr>
@@ -5960,7 +6192,7 @@
           <w:i/>
           <w:sz w:val="28"/>
         </w:rPr>
-        <w:t>รูปที่ 9  ค่า F1 จาก Cross-Validation ของแบบจำลองทั้ง 3 ชนิด</w:t>
+        <w:t>รูปที่ 9  ค่า F1 จาก Cross-Validation ของแบบจำลองทั้ง 5 ชนิด</w:t>
       </w:r>
     </w:p>
     <w:p>
@@ -6065,7 +6297,7 @@
           <w:i w:val="0"/>
           <w:sz w:val="32"/>
         </w:rPr>
-        <w:t>เนื่องจากข้อมูลไม่สมดุล การใช้ Accuracy เพียงอย่างเดียวจะให้ภาพที่คลาดเคลื่อน ดังเห็นได้จากการทำนายว่า "ไม่ยกเลิก" ทุกรายการ ซึ่งได้ค่า Accuracy สูงถึงร้อยละ 62.96 แต่มีค่า F1 เท่ากับ 0 คือไม่สามารถตรวจจับการยกเลิกได้เลยแม้แต่รายการเดียว</w:t>
+        <w:t>เนื่องจากข้อมูลไม่สมดุล การใช้ Accuracy เพียงอย่างเดียวจะให้ภาพที่คลาดเคลื่อน ดังเห็นได้จาก Dummy Classifier ที่ได้ Accuracy ร้อยละ 62.92 แต่มีค่า F1 เท่ากับ 0 คือไม่สามารถตรวจจับการยกเลิกได้เลยแม้แต่รายการเดียว</w:t>
       </w:r>
     </w:p>
     <w:p>
@@ -6377,6 +6609,88 @@
                 <w:sz w:val="30"/>
               </w:rPr>
               <w:t>0.152 → 0.122</w:t>
+            </w:r>
+          </w:p>
+        </w:tc>
+      </w:tr>
+      <w:tr>
+        <w:tc>
+          <w:tcPr>
+            <w:tcW w:type="dxa" w:w="2448"/>
+          </w:tcPr>
+          <w:p>
+            <w:r>
+              <w:rPr>
+                <w:rFonts w:ascii="TH SarabunPSK" w:hAnsi="TH SarabunPSK" w:cs="TH SarabunPSK"/>
+                <w:b w:val="0"/>
+                <w:i w:val="0"/>
+                <w:sz w:val="30"/>
+              </w:rPr>
+              <w:t>HistGradientBoosting</w:t>
+            </w:r>
+          </w:p>
+        </w:tc>
+        <w:tc>
+          <w:tcPr>
+            <w:tcW w:type="dxa" w:w="1296"/>
+          </w:tcPr>
+          <w:p>
+            <w:r>
+              <w:rPr>
+                <w:rFonts w:ascii="TH SarabunPSK" w:hAnsi="TH SarabunPSK" w:cs="TH SarabunPSK"/>
+                <w:b w:val="0"/>
+                <w:i w:val="0"/>
+                <w:sz w:val="30"/>
+              </w:rPr>
+              <w:t>0.8112</w:t>
+            </w:r>
+          </w:p>
+        </w:tc>
+        <w:tc>
+          <w:tcPr>
+            <w:tcW w:type="dxa" w:w="1296"/>
+          </w:tcPr>
+          <w:p>
+            <w:r>
+              <w:rPr>
+                <w:rFonts w:ascii="TH SarabunPSK" w:hAnsi="TH SarabunPSK" w:cs="TH SarabunPSK"/>
+                <w:b/>
+                <w:i w:val="0"/>
+                <w:sz w:val="30"/>
+              </w:rPr>
+              <w:t>0.8344</w:t>
+            </w:r>
+          </w:p>
+        </w:tc>
+        <w:tc>
+          <w:tcPr>
+            <w:tcW w:type="dxa" w:w="1296"/>
+          </w:tcPr>
+          <w:p>
+            <w:r>
+              <w:rPr>
+                <w:rFonts w:ascii="TH SarabunPSK" w:hAnsi="TH SarabunPSK" w:cs="TH SarabunPSK"/>
+                <w:b w:val="0"/>
+                <w:i w:val="0"/>
+                <w:sz w:val="30"/>
+              </w:rPr>
+              <w:t>+0.0232</w:t>
+            </w:r>
+          </w:p>
+        </w:tc>
+        <w:tc>
+          <w:tcPr>
+            <w:tcW w:type="dxa" w:w="2448"/>
+          </w:tcPr>
+          <w:p>
+            <w:r>
+              <w:rPr>
+                <w:rFonts w:ascii="TH SarabunPSK" w:hAnsi="TH SarabunPSK" w:cs="TH SarabunPSK"/>
+                <w:b w:val="0"/>
+                <w:i w:val="0"/>
+                <w:sz w:val="30"/>
+              </w:rPr>
+              <w:t>0.011 → 0.062</w:t>
             </w:r>
           </w:p>
         </w:tc>
@@ -6989,7 +7303,7 @@
           <w:i w:val="0"/>
           <w:sz w:val="32"/>
         </w:rPr>
-        <w:t>ค่า F1 ของ Random Forest แทบไม่เปลี่ยนแปลง (จาก 0.8422 เป็น 0.8419 ซึ่งน้อยกว่าค่าส่วนเบี่ยงเบนมาตรฐาน จึงถือว่าไม่ต่างกัน) แต่ช่องว่างระหว่างคะแนนชุดฝึกกับ Cross-Validation ลดลงจาก 0.152 เหลือ 0.122 แสดงว่าแบบจำลองจดจำข้อมูลชุดฝึกน้อยลงและมีเสถียรภาพมากขึ้น ส่วน Logistic Regression มีค่า F1 เพิ่มขึ้น 0.0155 จากการใช้ class_weight แบบ balanced ซึ่งช่วยชดเชยความไม่สมดุลของคลาส</w:t>
+        <w:t>ค่า F1 ของ Random Forest แทบไม่เปลี่ยนแปลง (จาก 0.8422 เป็น 0.8419 ซึ่งน้อยกว่าค่าส่วนเบี่ยงเบนมาตรฐาน จึงถือว่าไม่ต่างกัน) แต่ช่องว่างระหว่างคะแนนชุดฝึกกับ Cross-Validation ลดลงจาก 0.152 เหลือ 0.122 แสดงว่าแบบจำลองจดจำข้อมูลชุดฝึกน้อยลงและมีเสถียรภาพมากขึ้น ส่วน HistGradientBoosting มีค่า F1 เพิ่มขึ้นชัดเจนที่สุดคือ 0.0232 และ Logistic Regression เพิ่มขึ้น 0.0155 จากการใช้ class_weight แบบ balanced</w:t>
       </w:r>
     </w:p>
     <w:p>
@@ -7485,7 +7799,7 @@
           <w:i w:val="0"/>
           <w:sz w:val="32"/>
         </w:rPr>
-        <w:t>แบบจำลองมีค่า Recall สูงถึง 0.8590 คือตรวจจับการจองที่จะถูกยกเลิกได้เกือบร้อยละ 86 และมีค่า ROC-AUC 0.9567 แสดงว่าสามารถแยกสองคลาสออกจากกันได้ดีมาก โดยชนะเกณฑ์ขั้นต่ำซึ่งได้ค่า F1 เท่ากับ 0 อย่างชัดเจน</w:t>
+        <w:t>แบบจำลองมีค่า Recall สูงถึง 0.8590 คือตรวจจับการจองที่จะถูกยกเลิกได้เกือบร้อยละ 86 และมีค่า ROC-AUC 0.9567 แสดงว่าสามารถแยกสองคลาสออกจากกันได้ดีมาก โดยชนะเกณฑ์ขั้นต่ำ (Dummy ที่มี F1 = 0) อย่างชัดเจน</w:t>
       </w:r>
     </w:p>
     <w:p>
@@ -8999,6 +9313,104 @@
           </w:p>
         </w:tc>
       </w:tr>
+      <w:tr>
+        <w:tc>
+          <w:tcPr>
+            <w:tcW w:type="dxa" w:w="2736"/>
+          </w:tcPr>
+          <w:p>
+            <w:r>
+              <w:rPr>
+                <w:rFonts w:ascii="TH SarabunPSK" w:hAnsi="TH SarabunPSK" w:cs="TH SarabunPSK"/>
+                <w:b w:val="0"/>
+                <w:i w:val="0"/>
+                <w:sz w:val="30"/>
+              </w:rPr>
+              <w:t>HistGradientBoosting</w:t>
+            </w:r>
+          </w:p>
+        </w:tc>
+        <w:tc>
+          <w:tcPr>
+            <w:tcW w:type="dxa" w:w="1440"/>
+          </w:tcPr>
+          <w:p>
+            <w:r>
+              <w:rPr>
+                <w:rFonts w:ascii="TH SarabunPSK" w:hAnsi="TH SarabunPSK" w:cs="TH SarabunPSK"/>
+                <w:b w:val="0"/>
+                <w:i w:val="0"/>
+                <w:sz w:val="30"/>
+              </w:rPr>
+              <w:t>0.8355</w:t>
+            </w:r>
+          </w:p>
+        </w:tc>
+        <w:tc>
+          <w:tcPr>
+            <w:tcW w:type="dxa" w:w="1440"/>
+          </w:tcPr>
+          <w:p>
+            <w:r>
+              <w:rPr>
+                <w:rFonts w:ascii="TH SarabunPSK" w:hAnsi="TH SarabunPSK" w:cs="TH SarabunPSK"/>
+                <w:b w:val="0"/>
+                <w:i w:val="0"/>
+                <w:sz w:val="30"/>
+              </w:rPr>
+              <w:t>0.8116</w:t>
+            </w:r>
+          </w:p>
+        </w:tc>
+        <w:tc>
+          <w:tcPr>
+            <w:tcW w:type="dxa" w:w="1296"/>
+          </w:tcPr>
+          <w:p>
+            <w:r>
+              <w:rPr>
+                <w:rFonts w:ascii="TH SarabunPSK" w:hAnsi="TH SarabunPSK" w:cs="TH SarabunPSK"/>
+                <w:b w:val="0"/>
+                <w:i w:val="0"/>
+                <w:sz w:val="30"/>
+              </w:rPr>
+              <w:t>0.8610</w:t>
+            </w:r>
+          </w:p>
+        </w:tc>
+        <w:tc>
+          <w:tcPr>
+            <w:tcW w:type="dxa" w:w="1440"/>
+          </w:tcPr>
+          <w:p>
+            <w:r>
+              <w:rPr>
+                <w:rFonts w:ascii="TH SarabunPSK" w:hAnsi="TH SarabunPSK" w:cs="TH SarabunPSK"/>
+                <w:b w:val="0"/>
+                <w:i w:val="0"/>
+                <w:sz w:val="30"/>
+              </w:rPr>
+              <w:t>0.9524</w:t>
+            </w:r>
+          </w:p>
+        </w:tc>
+        <w:tc>
+          <w:tcPr>
+            <w:tcW w:type="dxa" w:w="1728"/>
+          </w:tcPr>
+          <w:p>
+            <w:r>
+              <w:rPr>
+                <w:rFonts w:ascii="TH SarabunPSK" w:hAnsi="TH SarabunPSK" w:cs="TH SarabunPSK"/>
+                <w:b w:val="0"/>
+                <w:i w:val="0"/>
+                <w:sz w:val="30"/>
+              </w:rPr>
+              <w:t>2.9</w:t>
+            </w:r>
+          </w:p>
+        </w:tc>
+      </w:tr>
     </w:tbl>
     <w:p>
       <w:pPr>
@@ -9026,7 +9438,7 @@
           <w:i w:val="0"/>
           <w:sz w:val="32"/>
         </w:rPr>
-        <w:t>Random Forest ให้ค่า F1 และ ROC-AUC สูงที่สุด จึงเลือกเป็นแบบจำลองสุดท้ายของโครงงาน ส่วน Logistic Regression แม้จะตีความง่ายที่สุดและไม่เกิด Overfitting แต่ค่า F1 ต่ำกว่าถึง 0.0687 เพราะเป็นแบบจำลองเชิงเส้นที่จับความสัมพันธ์ไม่เป็นเส้นตรง และปฏิสัมพันธ์ระหว่างตัวแปรไม่ได้ ส่วน Decision Tree แม้จะจับรูปแบบไม่เป็นเส้นตรงได้ แต่มีปัญหา Overfitting รุนแรงที่สุด (ช่องว่าง 0.203)</w:t>
+        <w:t>Random Forest ให้ค่า F1 และ ROC-AUC สูงที่สุด จึงเลือกเป็นแบบจำลองสุดท้ายของโครงงาน ส่วน HistGradientBoosting ให้ผลใกล้เคียงกัน (ต่ำกว่า 0.0114) แต่ใช้เวลาฝึกน้อยกว่าและไฟล์เล็กกว่ามาก จึงถูกเลือกไปใช้ในส่วนของเว็บแอปพลิเคชันแทน ส่วน Logistic Regression แม้จะตีความง่ายที่สุด แต่ค่า F1 ต่ำกว่าอย่างมีนัยสำคัญเพราะไม่สามารถจับความสัมพันธ์ที่ไม่เป็นเส้นตรงได้</w:t>
       </w:r>
     </w:p>
     <w:p>
@@ -9123,7 +9535,7 @@
           <w:i w:val="0"/>
           <w:sz w:val="32"/>
         </w:rPr>
-        <w:t>แบบจำลองที่ใช้บนเว็บเป็น Random Forest ฉบับย่อ ซึ่งลดจำนวนต้นไม้เหลือ 150 ต้น จำกัดความลึกสูงสุดที่ 25 และกำหนดจำนวนข้อมูลขั้นต่ำต่อใบเป็น 5 ทำให้ไฟล์มีขนาด 28.8 เมกะไบต์ แทนที่จะเป็น 356.8 เมกะไบต์ของแบบจำลองเต็ม เนื่องจากบริการโฮสต์แบบไม่มีค่าใช้จ่ายจำกัดหน่วยความจำไว้ และ GitHub จำกัดขนาดไฟล์ไว้ที่ 100 เมกะไบต์ โดยยอมแลกค่า F1 ที่ลดลง 0.0093 (จาก 0.8469 เหลือ 0.8376) เพื่อให้ระบบใช้งานได้จริง ค่า Threshold ของแบบจำลองนี้คำนวณใหม่ได้เท่ากับ 0.4754</w:t>
+        <w:t>แบบจำลองที่ใช้บนเว็บคือ HistGradientBoosting ซึ่งมีขนาดไฟล์ 0.8 เมกะไบต์ แทน Random Forest ที่มีขนาด 356.8 เมกะไบต์ เนื่องจากบริการโฮสต์แบบไม่มีค่าใช้จ่ายจำกัดหน่วยความจำไว้ โดยยอมแลกค่า F1 ที่ลดลง 0.0135 (จาก 0.8469 เหลือ 0.8334) เพื่อให้ระบบใช้งานได้จริง</w:t>
       </w:r>
     </w:p>
     <w:p>
@@ -9253,7 +9665,7 @@
                 <w:i w:val="0"/>
                 <w:sz w:val="30"/>
               </w:rPr>
-              <w:t>ร้อยละ 100.0</w:t>
+              <w:t>ร้อยละ 99.8</w:t>
             </w:r>
           </w:p>
         </w:tc>
@@ -9303,7 +9715,7 @@
                 <w:i w:val="0"/>
                 <w:sz w:val="30"/>
               </w:rPr>
-              <w:t>ร้อยละ 33.3</w:t>
+              <w:t>ร้อยละ 25.9</w:t>
             </w:r>
           </w:p>
         </w:tc>
@@ -9353,7 +9765,7 @@
                 <w:i w:val="0"/>
                 <w:sz w:val="30"/>
               </w:rPr>
-              <w:t>ร้อยละ 0.6</w:t>
+              <w:t>ร้อยละ 1.0</w:t>
             </w:r>
           </w:p>
         </w:tc>
@@ -9488,7 +9900,7 @@
           <w:i w:val="0"/>
           <w:sz w:val="32"/>
         </w:rPr>
-        <w:t>•  แบบจำลองบนเว็บเป็น Random Forest ฉบับย่อซึ่งมีค่า F1 ต่ำกว่าแบบจำลองเต็มในรายงาน 0.0093 เนื่องจากข้อจำกัดด้านขนาดไฟล์และหน่วยความจำของบริการโฮสต์</w:t>
+        <w:t>•  แบบจำลองบนเว็บเป็นคนละตัวกับแบบจำลองที่ให้ผลดีที่สุดในรายงาน เนื่องจากข้อจำกัดด้านขนาดไฟล์และหน่วยความจำ</w:t>
       </w:r>
     </w:p>
     <w:p>
@@ -9687,7 +10099,7 @@
           <w:i w:val="0"/>
           <w:sz w:val="32"/>
         </w:rPr>
-        <w:t>โครงงานนี้พัฒนาแบบจำลองสำหรับทำนายการยกเลิกการจองโรงแรมจากข้อมูลจริง 119,208 รายการ โดยผ่านกระบวนการตั้งแต่การสำรวจข้อมูล การทำความสะอาด การสร้างตัวแปรใหม่ 9 ตัว การคัดเลือกตัวแปรจาก 37 ตัวเหลือ 18 ตัวด้วยการลงคะแนนจาก 3 วิธี การเปรียบเทียบแบบจำลอง 3 ชนิด และการปรับ Hyperparameter แบบจำลองที่ดีที่สุดคือ Random Forest ซึ่งให้ค่า F1 เท่ากับ 0.8469 Precision 0.8351 Recall 0.8590 และ ROC-AUC 0.9567 บนชุดทดสอบที่ไม่เคยถูกใช้มาก่อน</w:t>
+        <w:t>โครงงานนี้พัฒนาแบบจำลองสำหรับทำนายการยกเลิกการจองโรงแรมจากข้อมูลจริง 119,208 รายการ โดยผ่านกระบวนการตั้งแต่การสำรวจข้อมูล การทำความสะอาด การสร้างตัวแปรใหม่ 9 ตัว การคัดเลือกตัวแปรจาก 37 ตัวเหลือ 18 ตัวด้วยการลงคะแนนจาก 3 วิธี การเปรียบเทียบแบบจำลอง 5 ชนิด และการปรับ Hyperparameter แบบจำลองที่ดีที่สุดคือ Random Forest ซึ่งให้ค่า F1 เท่ากับ 0.8469 Precision 0.8351 Recall 0.8590 และ ROC-AUC 0.9567 บนชุดทดสอบที่ไม่เคยถูกใช้มาก่อน</w:t>
       </w:r>
     </w:p>
     <w:p>
@@ -9727,7 +10139,7 @@
           <w:i w:val="0"/>
           <w:sz w:val="32"/>
         </w:rPr>
-        <w:t>ถือว่าตอบโจทย์ที่ตั้งไว้ เนื่องจากแบบจำลองสามารถทำนายการยกเลิกได้ดีกว่าเกณฑ์ขั้นต่ำอย่างชัดเจน (การทายว่าไม่ยกเลิกทุกรายการได้ค่า F1 เท่ากับ 0) และสามารถระบุปัจจัยเสี่ยงหลักได้ ได้แก่ ประเภทเงินมัดจำ เอเจนต์ที่ทำการจอง ระยะเวลาจองล่วงหน้า ประเทศของลูกค้า และจำนวนคำขอพิเศษ ซึ่งโรงแรมสามารถนำไปกำหนดนโยบายรับมือได้</w:t>
+        <w:t>ถือว่าตอบโจทย์ที่ตั้งไว้ เนื่องจากแบบจำลองสามารถทำนายการยกเลิกได้ดีกว่าเกณฑ์ขั้นต่ำอย่างชัดเจน (Dummy Classifier มีค่า F1 เท่ากับ 0) และสามารถระบุปัจจัยเสี่ยงหลักได้ ได้แก่ ประเภทเงินมัดจำ เอเจนต์ที่ทำการจอง ระยะเวลาจองล่วงหน้า ประเทศของลูกค้า และจำนวนคำขอพิเศษ ซึ่งโรงแรมสามารถนำไปกำหนดนโยบายรับมือได้</w:t>
       </w:r>
     </w:p>
     <w:p>

</xml_diff>

<commit_message>
Serve a reduced Random Forest on the web app
The report's best model is Random Forest, so the demo now runs the same
model type instead of HistGradientBoosting: 150 trees, max_depth 25,
min_samples_leaf 5 -> 28.8 MB, test F1 0.8376 at threshold 0.4754
(0.0093 below the full 356.8 MB forest).

HistGradientBoosting stays in the report and slides as one of the five
models compared. Deployment sections and demo examples updated.

Co-Authored-By: Claude Opus 5 <noreply@anthropic.com>
</commit_message>
<xml_diff>
--- a/docs/รายงานโครงงาน-Hotel-Booking-Cancellation-Prediction.docx
+++ b/docs/รายงานโครงงาน-Hotel-Booking-Cancellation-Prediction.docx
@@ -9438,7 +9438,7 @@
           <w:i w:val="0"/>
           <w:sz w:val="32"/>
         </w:rPr>
-        <w:t>Random Forest ให้ค่า F1 และ ROC-AUC สูงที่สุด จึงเลือกเป็นแบบจำลองสุดท้ายของโครงงาน ส่วน HistGradientBoosting ให้ผลใกล้เคียงกัน (ต่ำกว่า 0.0114) แต่ใช้เวลาฝึกน้อยกว่าและไฟล์เล็กกว่ามาก จึงถูกเลือกไปใช้ในส่วนของเว็บแอปพลิเคชันแทน ส่วน Logistic Regression แม้จะตีความง่ายที่สุด แต่ค่า F1 ต่ำกว่าอย่างมีนัยสำคัญเพราะไม่สามารถจับความสัมพันธ์ที่ไม่เป็นเส้นตรงได้</w:t>
+        <w:t>Random Forest ให้ค่า F1 และ ROC-AUC สูงที่สุด จึงเลือกเป็นแบบจำลองสุดท้ายของโครงงาน ส่วน HistGradientBoosting ให้ผลใกล้เคียงกัน (ต่ำกว่า 0.0114) และใช้เวลาฝึกน้อยกว่า ส่วน Logistic Regression แม้จะตีความง่ายที่สุด แต่ค่า F1 ต่ำกว่าอย่างมีนัยสำคัญ เพราะไม่สามารถจับความสัมพันธ์ที่ไม่เป็นเส้นตรงได้ ดังนั้นแบบจำลองที่นำไปใช้งานจริงในส่วนของเว็บแอปพลิเคชันจึงเป็น Random Forest เช่นเดียวกัน เพียงแต่ลดขนาดลงให้เหมาะกับข้อจำกัดของบริการโฮสต์</w:t>
       </w:r>
     </w:p>
     <w:p>
@@ -9535,7 +9535,7 @@
           <w:i w:val="0"/>
           <w:sz w:val="32"/>
         </w:rPr>
-        <w:t>แบบจำลองที่ใช้บนเว็บคือ HistGradientBoosting ซึ่งมีขนาดไฟล์ 0.8 เมกะไบต์ แทน Random Forest ที่มีขนาด 356.8 เมกะไบต์ เนื่องจากบริการโฮสต์แบบไม่มีค่าใช้จ่ายจำกัดหน่วยความจำไว้ โดยยอมแลกค่า F1 ที่ลดลง 0.0135 (จาก 0.8469 เหลือ 0.8334) เพื่อให้ระบบใช้งานได้จริง</w:t>
+        <w:t>แบบจำลองที่ใช้บนเว็บเป็น Random Forest ชนิดเดียวกับที่รายงานสรุปว่าดีที่สุด แต่ลดขนาดลงโดยใช้ต้นไม้ 150 ต้น จำกัดความลึกสูงสุดที่ 25 และกำหนดจำนวนข้อมูลขั้นต่ำต่อใบเป็น 5 ทำให้ไฟล์มีขนาด 28.8 เมกะไบต์ แทนที่จะเป็น 356.8 เมกะไบต์ของแบบจำลองเต็ม เนื่องจากบริการโฮสต์แบบไม่มีค่าใช้จ่ายจำกัดหน่วยความจำไว้ที่ 1 กิกะไบต์ และ GitHub จำกัดขนาดไฟล์ไว้ที่ 100 เมกะไบต์ แบบจำลองฉบับย่อนี้ให้ค่า F1 เท่ากับ 0.8376 ที่ค่า Threshold 0.4754 ซึ่งต่ำกว่าแบบจำลองเต็มเพียง 0.0093</w:t>
       </w:r>
     </w:p>
     <w:p>
@@ -9665,7 +9665,7 @@
                 <w:i w:val="0"/>
                 <w:sz w:val="30"/>
               </w:rPr>
-              <w:t>ร้อยละ 99.8</w:t>
+              <w:t>ร้อยละ 100.0</w:t>
             </w:r>
           </w:p>
         </w:tc>
@@ -9715,7 +9715,7 @@
                 <w:i w:val="0"/>
                 <w:sz w:val="30"/>
               </w:rPr>
-              <w:t>ร้อยละ 25.9</w:t>
+              <w:t>ร้อยละ 33.3</w:t>
             </w:r>
           </w:p>
         </w:tc>
@@ -9765,7 +9765,7 @@
                 <w:i w:val="0"/>
                 <w:sz w:val="30"/>
               </w:rPr>
-              <w:t>ร้อยละ 1.0</w:t>
+              <w:t>ร้อยละ 0.6</w:t>
             </w:r>
           </w:p>
         </w:tc>
@@ -9900,7 +9900,7 @@
           <w:i w:val="0"/>
           <w:sz w:val="32"/>
         </w:rPr>
-        <w:t>•  แบบจำลองบนเว็บเป็นคนละตัวกับแบบจำลองที่ให้ผลดีที่สุดในรายงาน เนื่องจากข้อจำกัดด้านขนาดไฟล์และหน่วยความจำ</w:t>
+        <w:t>•  แบบจำลองบนเว็บเป็น Random Forest ฉบับย่อซึ่งให้ค่า F1 ต่ำกว่าแบบจำลองเต็มในรายงาน 0.0093 เนื่องจากข้อจำกัดด้านขนาดไฟล์และหน่วยความจำของบริการโฮสต์</w:t>
       </w:r>
     </w:p>
     <w:p>

</xml_diff>